<commit_message>
Manager copy: remove author name, affiliation and AI-assistance statements
Co-Authored-By: Claude Sonnet 5.5 <noreply@anthropic.com>
</commit_message>
<xml_diff>
--- a/paper/manager_copy/Fine-Tuning_Small_Decision_Model_Paper.docx
+++ b/paper/manager_copy/Fine-Tuning_Small_Decision_Model_Paper.docx
@@ -28,32 +28,6 @@
           <w:sz w:val="26"/>
         </w:rPr>
         <w:t>A controlled study against calibrated baselines</w:t>
-      </w:r>
-    </w:p>
-    <w:p>
-      <w:pPr>
-        <w:keepNext w:val="0"/>
-        <w:spacing w:after="0"/>
-        <w:jc w:val="center"/>
-      </w:pPr>
-      <w:r>
-        <w:rPr>
-          <w:sz w:val="24"/>
-        </w:rPr>
-        <w:t>Astitwa Agarwal</w:t>
-      </w:r>
-    </w:p>
-    <w:p>
-      <w:pPr>
-        <w:keepNext w:val="0"/>
-        <w:spacing w:after="200"/>
-        <w:jc w:val="center"/>
-      </w:pPr>
-      <w:r>
-        <w:rPr>
-          <w:sz w:val="21"/>
-        </w:rPr>
-        <w:t>Independent researcher</w:t>
       </w:r>
     </w:p>
     <w:p>
@@ -4800,23 +4774,6 @@
       <w:r>
         <w:rPr/>
         <w:t>The experimental materials, including the trained model and the per-question results behind every table, are held by the author and are available on request. Public datasets were used under their own licences and are not redistributed.</w:t>
-      </w:r>
-    </w:p>
-    <w:p>
-      <w:pPr>
-        <w:pStyle w:val="Heading2"/>
-      </w:pPr>
-      <w:r>
-        <w:t>Use of AI assistance</w:t>
-      </w:r>
-    </w:p>
-    <w:p>
-      <w:pPr>
-        <w:keepNext w:val="0"/>
-      </w:pPr>
-      <w:r>
-        <w:rPr/>
-        <w:t>The experiments, the analysis and drafts of this manuscript were produced with the assistance of an AI model (Claude, Anthropic) working under the author's direction. The author is responsible for the content. All numerical results come from the experiment logs. The arXiv references in the related-work section were checked against their abstract pages; web sources are cited as accessed, and the dataset citations in Appendix C should be re-verified before submission.</w:t>
       </w:r>
     </w:p>
     <w:p>
@@ -12971,7 +12928,7 @@
               <w:rPr>
                 <w:sz w:val="17"/>
               </w:rPr>
-              <w:t>generated procedurally by the author</w:t>
+              <w:t>generated procedurally</w:t>
             </w:r>
           </w:p>
         </w:tc>

</xml_diff>